<commit_message>
Modified code for exception ,validation and documentation
</commit_message>
<xml_diff>
--- a/CaseStudy-Architecture-README.docx
+++ b/CaseStudy-Architecture-README.docx
@@ -80,6 +80,177 @@
       </w:pPr>
       <w:r>
         <w:t>2. Architecture</w:t>
+      </w:r>
+    </w:p>
+    <w:p>
+      <w:pPr>
+        <w:rPr>
+          <w:rFonts w:hint="eastAsia"/>
+        </w:rPr>
+      </w:pPr>
+      <w:proofErr w:type="spellStart"/>
+      <w:r>
+        <w:rPr>
+          <w:rFonts w:hint="eastAsia"/>
+        </w:rPr>
+        <w:t>TaskService</w:t>
+      </w:r>
+      <w:proofErr w:type="spellEnd"/>
+      <w:r>
+        <w:rPr>
+          <w:rFonts w:hint="eastAsia"/>
+        </w:rPr>
+        <w:t xml:space="preserve"> follows a layered architecture inspired by Clean Architecture principles, providing separation of concerns, testability, and maintainability.</w:t>
+      </w:r>
+    </w:p>
+    <w:p>
+      <w:pPr>
+        <w:rPr>
+          <w:b/>
+          <w:bCs/>
+        </w:rPr>
+      </w:pPr>
+      <w:r>
+        <w:rPr>
+          <w:rFonts w:hint="eastAsia"/>
+          <w:b/>
+          <w:bCs/>
+        </w:rPr>
+        <w:t>High-Level Architecture</w:t>
+      </w:r>
+    </w:p>
+    <w:p>
+      <w:pPr>
+        <w:pStyle w:val="NormalWeb"/>
+      </w:pPr>
+      <w:r>
+        <w:rPr>
+          <w:noProof/>
+        </w:rPr>
+        <w:drawing>
+          <wp:inline distT="0" distB="0" distL="0" distR="0">
+            <wp:extent cx="2711449" cy="4067175"/>
+            <wp:effectExtent l="0" t="0" r="0" b="0"/>
+            <wp:docPr id="3" name="Picture 3" descr="C:\Users\User\Downloads\image.png"/>
+            <wp:cNvGraphicFramePr>
+              <a:graphicFrameLocks xmlns:a="http://schemas.openxmlformats.org/drawingml/2006/main" noChangeAspect="1"/>
+            </wp:cNvGraphicFramePr>
+            <a:graphic xmlns:a="http://schemas.openxmlformats.org/drawingml/2006/main">
+              <a:graphicData uri="http://schemas.openxmlformats.org/drawingml/2006/picture">
+                <pic:pic xmlns:pic="http://schemas.openxmlformats.org/drawingml/2006/picture">
+                  <pic:nvPicPr>
+                    <pic:cNvPr id="0" name="Picture 8" descr="C:\Users\User\Downloads\image.png"/>
+                    <pic:cNvPicPr>
+                      <a:picLocks noChangeAspect="1" noChangeArrowheads="1"/>
+                    </pic:cNvPicPr>
+                  </pic:nvPicPr>
+                  <pic:blipFill>
+                    <a:blip r:embed="rId9">
+                      <a:extLst>
+                        <a:ext uri="{28A0092B-C50C-407E-A947-70E740481C1C}">
+                          <a14:useLocalDpi xmlns:a14="http://schemas.microsoft.com/office/drawing/2010/main" val="0"/>
+                        </a:ext>
+                      </a:extLst>
+                    </a:blip>
+                    <a:srcRect/>
+                    <a:stretch>
+                      <a:fillRect/>
+                    </a:stretch>
+                  </pic:blipFill>
+                  <pic:spPr bwMode="auto">
+                    <a:xfrm>
+                      <a:off x="0" y="0"/>
+                      <a:ext cx="2718146" cy="4077221"/>
+                    </a:xfrm>
+                    <a:prstGeom prst="rect">
+                      <a:avLst/>
+                    </a:prstGeom>
+                    <a:noFill/>
+                    <a:ln>
+                      <a:noFill/>
+                    </a:ln>
+                  </pic:spPr>
+                </pic:pic>
+              </a:graphicData>
+            </a:graphic>
+          </wp:inline>
+        </w:drawing>
+      </w:r>
+    </w:p>
+    <w:p/>
+    <w:p>
+      <w:r>
+        <w:rPr>
+          <w:noProof/>
+          <w:lang w:val="en-IN" w:eastAsia="en-IN" w:bidi="hi-IN"/>
+        </w:rPr>
+        <w:lastRenderedPageBreak/>
+        <mc:AlternateContent>
+          <mc:Choice Requires="wps">
+            <w:drawing>
+              <wp:inline distT="0" distB="0" distL="0" distR="0">
+                <wp:extent cx="304800" cy="304800"/>
+                <wp:effectExtent l="0" t="0" r="0" b="0"/>
+                <wp:docPr id="1" name="Rectangle 1" descr="Generated image: Layered Software Architecture Flowchart"/>
+                <wp:cNvGraphicFramePr>
+                  <a:graphicFrameLocks xmlns:a="http://schemas.openxmlformats.org/drawingml/2006/main" noChangeAspect="1"/>
+                </wp:cNvGraphicFramePr>
+                <a:graphic xmlns:a="http://schemas.openxmlformats.org/drawingml/2006/main">
+                  <a:graphicData uri="http://schemas.microsoft.com/office/word/2010/wordprocessingShape">
+                    <wps:wsp>
+                      <wps:cNvSpPr>
+                        <a:spLocks noChangeAspect="1" noChangeArrowheads="1"/>
+                      </wps:cNvSpPr>
+                      <wps:spPr bwMode="auto">
+                        <a:xfrm>
+                          <a:off x="0" y="0"/>
+                          <a:ext cx="304800" cy="304800"/>
+                        </a:xfrm>
+                        <a:prstGeom prst="rect">
+                          <a:avLst/>
+                        </a:prstGeom>
+                        <a:noFill/>
+                        <a:ln>
+                          <a:noFill/>
+                        </a:ln>
+                        <a:extLst>
+                          <a:ext uri="{909E8E84-426E-40DD-AFC4-6F175D3DCCD1}">
+                            <a14:hiddenFill xmlns:a14="http://schemas.microsoft.com/office/drawing/2010/main">
+                              <a:solidFill>
+                                <a:srgbClr val="FFFFFF"/>
+                              </a:solidFill>
+                            </a14:hiddenFill>
+                          </a:ext>
+                          <a:ext uri="{91240B29-F687-4F45-9708-019B960494DF}">
+                            <a14:hiddenLine xmlns:a14="http://schemas.microsoft.com/office/drawing/2010/main" w="9525">
+                              <a:solidFill>
+                                <a:srgbClr val="000000"/>
+                              </a:solidFill>
+                              <a:miter lim="800000"/>
+                              <a:headEnd/>
+                              <a:tailEnd/>
+                            </a14:hiddenLine>
+                          </a:ext>
+                        </a:extLst>
+                      </wps:spPr>
+                      <wps:bodyPr rot="0" vert="horz" wrap="square" lIns="91440" tIns="45720" rIns="91440" bIns="45720" anchor="t" anchorCtr="0" upright="1">
+                        <a:noAutofit/>
+                      </wps:bodyPr>
+                    </wps:wsp>
+                  </a:graphicData>
+                </a:graphic>
+              </wp:inline>
+            </w:drawing>
+          </mc:Choice>
+          <mc:Fallback>
+            <w:pict>
+              <v:rect id="Rectangle 1" o:spid="_x0000_s1026" alt="Description: Generated image: Layered Software Architecture Flowchart" style="width:24pt;height:24pt;visibility:visible;mso-wrap-style:square;mso-left-percent:-10001;mso-top-percent:-10001;mso-position-horizontal:absolute;mso-position-horizontal-relative:char;mso-position-vertical:absolute;mso-position-vertical-relative:line;mso-left-percent:-10001;mso-top-percent:-10001;v-text-anchor:top" o:gfxdata="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" filled="f" stroked="f">
+                <o:lock v:ext="edit" aspectratio="t"/>
+                <w10:anchorlock/>
+              </v:rect>
+            </w:pict>
+          </mc:Fallback>
+        </mc:AlternateContent>
       </w:r>
     </w:p>
     <w:p>
@@ -213,19 +384,21 @@
       </w:r>
       <w:r>
         <w:br/>
-        <w:t xml:space="preserve">    │   └── Controllers</w:t>
+        <w:t xml:space="preserve">    │ </w:t>
+      </w:r>
+      <w:r>
+        <w:t xml:space="preserve">  └── Controllers</w:t>
       </w:r>
       <w:r>
         <w:br/>
-      </w:r>
-      <w:r>
-        <w:lastRenderedPageBreak/>
         <w:t xml:space="preserve">    │</w:t>
       </w:r>
       <w:r>
         <w:br/>
-        <w:t xml:space="preserve">    └── Integration</w:t>
+        <w:t xml:space="preserve">    </w:t>
       </w:r>
+      <w:bookmarkStart w:id="0" w:name="_GoBack"/>
+      <w:bookmarkEnd w:id="0"/>
     </w:p>
     <w:p>
       <w:pPr>
@@ -296,6 +469,7 @@
         <w:pStyle w:val="Heading2"/>
       </w:pPr>
       <w:r>
+        <w:lastRenderedPageBreak/>
         <w:t>2.2 Dependency Direction</w:t>
       </w:r>
     </w:p>
@@ -452,7 +626,6 @@
         <w:pStyle w:val="Heading2"/>
       </w:pPr>
       <w:r>
-        <w:lastRenderedPageBreak/>
         <w:t>Tests</w:t>
       </w:r>
     </w:p>
@@ -649,6 +822,7 @@
         <w:pStyle w:val="Heading1"/>
       </w:pPr>
       <w:r>
+        <w:lastRenderedPageBreak/>
         <w:t>5. API Design</w:t>
       </w:r>
     </w:p>
@@ -1250,7 +1424,6 @@
               </w:rPr>
             </w:pPr>
             <w:r>
-              <w:lastRenderedPageBreak/>
               <w:t>_rid</w:t>
             </w:r>
           </w:p>
@@ -1681,13 +1854,12 @@
         <w:pStyle w:val="Heading1"/>
       </w:pPr>
       <w:r>
+        <w:lastRenderedPageBreak/>
         <w:t>8</w:t>
       </w:r>
       <w:r>
         <w:t>. Validation</w:t>
       </w:r>
-      <w:bookmarkStart w:id="0" w:name="_GoBack"/>
-      <w:bookmarkEnd w:id="0"/>
     </w:p>
     <w:p>
       <w:pPr>
@@ -1919,7 +2091,6 @@
         </w:rPr>
       </w:pPr>
       <w:r>
-        <w:lastRenderedPageBreak/>
         <w:t>Delete existing task.</w:t>
       </w:r>
     </w:p>
@@ -2061,6 +2232,7 @@
         </w:rPr>
       </w:pPr>
       <w:r>
+        <w:lastRenderedPageBreak/>
         <w:t>Read using ID and partition key.</w:t>
       </w:r>
     </w:p>
@@ -2309,7 +2481,6 @@
         <w:pStyle w:val="Heading1"/>
       </w:pPr>
       <w:r>
-        <w:lastRenderedPageBreak/>
         <w:t>12</w:t>
       </w:r>
       <w:r>
@@ -2464,6 +2635,7 @@
         <w:pStyle w:val="Heading1"/>
       </w:pPr>
       <w:r>
+        <w:lastRenderedPageBreak/>
         <w:t>16. Final Architecture Summary</w:t>
       </w:r>
     </w:p>
@@ -2554,7 +2726,7 @@
       </w:r>
     </w:p>
     <w:sectPr>
-      <w:footerReference w:type="default" r:id="rId9"/>
+      <w:footerReference w:type="default" r:id="rId10"/>
       <w:pgSz w:w="12240" w:h="15840"/>
       <w:pgMar w:top="936" w:right="1080" w:bottom="936" w:left="1080" w:header="720" w:footer="720" w:gutter="0"/>
       <w:cols w:space="720"/>
@@ -14697,6 +14869,53 @@
       </w:tcPr>
     </w:tblStylePr>
   </w:style>
+  <w:style w:type="paragraph" w:styleId="NormalWeb">
+    <w:name w:val="Normal (Web)"/>
+    <w:basedOn w:val="Normal"/>
+    <w:uiPriority w:val="99"/>
+    <w:semiHidden/>
+    <w:unhideWhenUsed/>
+    <w:rsid w:val="00BA633D"/>
+    <w:pPr>
+      <w:spacing w:before="100" w:beforeAutospacing="1" w:after="100" w:afterAutospacing="1" w:line="240" w:lineRule="auto"/>
+    </w:pPr>
+    <w:rPr>
+      <w:rFonts w:ascii="Times New Roman" w:eastAsia="Times New Roman" w:hAnsi="Times New Roman" w:cs="Times New Roman"/>
+      <w:sz w:val="24"/>
+      <w:szCs w:val="24"/>
+      <w:lang w:val="en-IN" w:eastAsia="en-IN" w:bidi="hi-IN"/>
+    </w:rPr>
+  </w:style>
+  <w:style w:type="paragraph" w:styleId="BalloonText">
+    <w:name w:val="Balloon Text"/>
+    <w:basedOn w:val="Normal"/>
+    <w:link w:val="BalloonTextChar"/>
+    <w:uiPriority w:val="99"/>
+    <w:semiHidden/>
+    <w:unhideWhenUsed/>
+    <w:rsid w:val="00BA633D"/>
+    <w:pPr>
+      <w:spacing w:after="0" w:line="240" w:lineRule="auto"/>
+    </w:pPr>
+    <w:rPr>
+      <w:rFonts w:ascii="Tahoma" w:hAnsi="Tahoma" w:cs="Tahoma"/>
+      <w:sz w:val="16"/>
+      <w:szCs w:val="16"/>
+    </w:rPr>
+  </w:style>
+  <w:style w:type="character" w:customStyle="1" w:styleId="BalloonTextChar">
+    <w:name w:val="Balloon Text Char"/>
+    <w:basedOn w:val="DefaultParagraphFont"/>
+    <w:link w:val="BalloonText"/>
+    <w:uiPriority w:val="99"/>
+    <w:semiHidden/>
+    <w:rsid w:val="00BA633D"/>
+    <w:rPr>
+      <w:rFonts w:ascii="Tahoma" w:hAnsi="Tahoma" w:cs="Tahoma"/>
+      <w:sz w:val="16"/>
+      <w:szCs w:val="16"/>
+    </w:rPr>
+  </w:style>
 </w:styles>
 </file>
 
@@ -26546,6 +26765,53 @@
         <w:shd w:val="clear" w:color="auto" w:fill="FBCAA2" w:themeFill="accent6" w:themeFillTint="7F"/>
       </w:tcPr>
     </w:tblStylePr>
+  </w:style>
+  <w:style w:type="paragraph" w:styleId="NormalWeb">
+    <w:name w:val="Normal (Web)"/>
+    <w:basedOn w:val="Normal"/>
+    <w:uiPriority w:val="99"/>
+    <w:semiHidden/>
+    <w:unhideWhenUsed/>
+    <w:rsid w:val="00BA633D"/>
+    <w:pPr>
+      <w:spacing w:before="100" w:beforeAutospacing="1" w:after="100" w:afterAutospacing="1" w:line="240" w:lineRule="auto"/>
+    </w:pPr>
+    <w:rPr>
+      <w:rFonts w:ascii="Times New Roman" w:eastAsia="Times New Roman" w:hAnsi="Times New Roman" w:cs="Times New Roman"/>
+      <w:sz w:val="24"/>
+      <w:szCs w:val="24"/>
+      <w:lang w:val="en-IN" w:eastAsia="en-IN" w:bidi="hi-IN"/>
+    </w:rPr>
+  </w:style>
+  <w:style w:type="paragraph" w:styleId="BalloonText">
+    <w:name w:val="Balloon Text"/>
+    <w:basedOn w:val="Normal"/>
+    <w:link w:val="BalloonTextChar"/>
+    <w:uiPriority w:val="99"/>
+    <w:semiHidden/>
+    <w:unhideWhenUsed/>
+    <w:rsid w:val="00BA633D"/>
+    <w:pPr>
+      <w:spacing w:after="0" w:line="240" w:lineRule="auto"/>
+    </w:pPr>
+    <w:rPr>
+      <w:rFonts w:ascii="Tahoma" w:hAnsi="Tahoma" w:cs="Tahoma"/>
+      <w:sz w:val="16"/>
+      <w:szCs w:val="16"/>
+    </w:rPr>
+  </w:style>
+  <w:style w:type="character" w:customStyle="1" w:styleId="BalloonTextChar">
+    <w:name w:val="Balloon Text Char"/>
+    <w:basedOn w:val="DefaultParagraphFont"/>
+    <w:link w:val="BalloonText"/>
+    <w:uiPriority w:val="99"/>
+    <w:semiHidden/>
+    <w:rsid w:val="00BA633D"/>
+    <w:rPr>
+      <w:rFonts w:ascii="Tahoma" w:hAnsi="Tahoma" w:cs="Tahoma"/>
+      <w:sz w:val="16"/>
+      <w:szCs w:val="16"/>
+    </w:rPr>
   </w:style>
 </w:styles>
 </file>
@@ -26875,7 +27141,7 @@
 </file>
 
 <file path=customXml/itemProps1.xml><?xml version="1.0" encoding="utf-8"?>
-<ds:datastoreItem xmlns:ds="http://schemas.openxmlformats.org/officeDocument/2006/customXml" ds:itemID="{2734E868-A305-41E2-ABFC-10BFFFDC09E5}">
+<ds:datastoreItem xmlns:ds="http://schemas.openxmlformats.org/officeDocument/2006/customXml" ds:itemID="{8D821026-EB90-443F-AC42-BD1BBBB2B44F}">
   <ds:schemaRefs>
     <ds:schemaRef ds:uri="http://schemas.openxmlformats.org/officeDocument/2006/bibliography"/>
   </ds:schemaRefs>

</xml_diff>